<commit_message>
feat: add theme-toggle agent + update README
Adds .claude/agents/theme-toggle.md sub-agent definition for the dark/light theme toggle feature. Updates README with a Features section documenting all site capabilities including the new theme toggle.

Co-Authored-By: Claude Sonnet 4.6 <noreply@anthropic.com>
</commit_message>
<xml_diff>
--- a/QUESTION 1.docx
+++ b/QUESTION 1.docx
@@ -54,10 +54,10 @@
     <w:p>
       <w:r>
         <w:drawing>
-          <wp:inline distT="0" distB="0" distL="0" distR="0" wp14:anchorId="1930F61B" wp14:editId="12CEE90A">
-            <wp:extent cx="5943600" cy="3138805"/>
+          <wp:inline distT="0" distB="0" distL="0" distR="0" wp14:anchorId="71D83B8B" wp14:editId="6B21F801">
+            <wp:extent cx="5943600" cy="3519805"/>
             <wp:effectExtent l="0" t="0" r="0" b="4445"/>
-            <wp:docPr id="1334423207" name="Picture 1"/>
+            <wp:docPr id="1755697692" name="Picture 1"/>
             <wp:cNvGraphicFramePr>
               <a:graphicFrameLocks xmlns:a="http://schemas.openxmlformats.org/drawingml/2006/main" noChangeAspect="1"/>
             </wp:cNvGraphicFramePr>
@@ -65,7 +65,7 @@
               <a:graphicData uri="http://schemas.openxmlformats.org/drawingml/2006/picture">
                 <pic:pic xmlns:pic="http://schemas.openxmlformats.org/drawingml/2006/picture">
                   <pic:nvPicPr>
-                    <pic:cNvPr id="1334423207" name=""/>
+                    <pic:cNvPr id="1755697692" name=""/>
                     <pic:cNvPicPr/>
                   </pic:nvPicPr>
                   <pic:blipFill>
@@ -77,7 +77,52 @@
                   <pic:spPr>
                     <a:xfrm>
                       <a:off x="0" y="0"/>
-                      <a:ext cx="5943600" cy="3138805"/>
+                      <a:ext cx="5943600" cy="3519805"/>
+                    </a:xfrm>
+                    <a:prstGeom prst="rect">
+                      <a:avLst/>
+                    </a:prstGeom>
+                  </pic:spPr>
+                </pic:pic>
+              </a:graphicData>
+            </a:graphic>
+          </wp:inline>
+        </w:drawing>
+      </w:r>
+    </w:p>
+    <w:p>
+      <w:r>
+        <w:lastRenderedPageBreak/>
+        <w:t xml:space="preserve">QUESTION 3 </w:t>
+      </w:r>
+    </w:p>
+    <w:p>
+      <w:r>
+        <w:drawing>
+          <wp:inline distT="0" distB="0" distL="0" distR="0" wp14:anchorId="436C33C7" wp14:editId="3B2875EA">
+            <wp:extent cx="5943600" cy="3131185"/>
+            <wp:effectExtent l="0" t="0" r="0" b="0"/>
+            <wp:docPr id="285011113" name="Picture 1"/>
+            <wp:cNvGraphicFramePr>
+              <a:graphicFrameLocks xmlns:a="http://schemas.openxmlformats.org/drawingml/2006/main" noChangeAspect="1"/>
+            </wp:cNvGraphicFramePr>
+            <a:graphic xmlns:a="http://schemas.openxmlformats.org/drawingml/2006/main">
+              <a:graphicData uri="http://schemas.openxmlformats.org/drawingml/2006/picture">
+                <pic:pic xmlns:pic="http://schemas.openxmlformats.org/drawingml/2006/picture">
+                  <pic:nvPicPr>
+                    <pic:cNvPr id="285011113" name=""/>
+                    <pic:cNvPicPr/>
+                  </pic:nvPicPr>
+                  <pic:blipFill>
+                    <a:blip r:embed="rId6"/>
+                    <a:stretch>
+                      <a:fillRect/>
+                    </a:stretch>
+                  </pic:blipFill>
+                  <pic:spPr>
+                    <a:xfrm>
+                      <a:off x="0" y="0"/>
+                      <a:ext cx="5943600" cy="3131185"/>
                     </a:xfrm>
                     <a:prstGeom prst="rect">
                       <a:avLst/>

</xml_diff>